<commit_message>
Add exercise sort functions and docs
</commit_message>
<xml_diff>
--- a/fitforge/Doc Projet.docx
+++ b/fitforge/Doc Projet.docx
@@ -5,17 +5,38 @@
     <w:p>
       <w:pPr>
         <w:pStyle w:val="Titre2"/>
+        <w:rPr>
+          <w:rFonts w:asciiTheme="minorHAnsi" w:hAnsiTheme="minorHAnsi"/>
+        </w:rPr>
       </w:pPr>
-      <w:r>
+      <w:proofErr w:type="spellStart"/>
+      <w:r>
+        <w:rPr>
+          <w:rFonts w:asciiTheme="minorHAnsi" w:hAnsiTheme="minorHAnsi"/>
+        </w:rPr>
         <w:t>FitForge</w:t>
       </w:r>
+      <w:proofErr w:type="spellEnd"/>
     </w:p>
     <w:p>
       <w:r>
         <w:t xml:space="preserve">Fit Forge est une application </w:t>
       </w:r>
-      <w:r>
-        <w:t xml:space="preserve">developpé avec flutter et dart, </w:t>
+      <w:proofErr w:type="spellStart"/>
+      <w:r>
+        <w:t>developpé</w:t>
+      </w:r>
+      <w:proofErr w:type="spellEnd"/>
+      <w:r>
+        <w:t xml:space="preserve"> avec flutter et </w:t>
+      </w:r>
+      <w:proofErr w:type="spellStart"/>
+      <w:r>
+        <w:t>dart</w:t>
+      </w:r>
+      <w:proofErr w:type="spellEnd"/>
+      <w:r>
+        <w:t xml:space="preserve">, </w:t>
       </w:r>
       <w:r>
         <w:t>qui permet aux utilisateurs de créer et de suivre leurs programmes sportifs.</w:t>
@@ -25,20 +46,29 @@
       <w:pPr>
         <w:pStyle w:val="Titre3"/>
       </w:pPr>
-      <w:r>
-        <w:t>Diagrame des classes.</w:t>
+      <w:proofErr w:type="spellStart"/>
+      <w:r>
+        <w:t>Diagrame</w:t>
+      </w:r>
+      <w:proofErr w:type="spellEnd"/>
+      <w:r>
+        <w:t xml:space="preserve"> des classes.</w:t>
       </w:r>
     </w:p>
     <w:p>
       <w:pPr>
         <w:pStyle w:val="Titre2"/>
+        <w:rPr>
+          <w:rFonts w:asciiTheme="minorHAnsi" w:hAnsiTheme="minorHAnsi"/>
+        </w:rPr>
       </w:pPr>
       <w:r>
         <w:rPr>
+          <w:rFonts w:asciiTheme="minorHAnsi" w:hAnsiTheme="minorHAnsi"/>
           <w:noProof/>
         </w:rPr>
         <w:drawing>
-          <wp:inline distT="0" distB="0" distL="0" distR="0" wp14:anchorId="165F5EA9" wp14:editId="68D77DBB">
+          <wp:inline distT="0" distB="0" distL="0" distR="0" wp14:anchorId="165F5EA9" wp14:editId="0F39ECE5">
             <wp:extent cx="2233493" cy="3166822"/>
             <wp:effectExtent l="0" t="0" r="1905" b="0"/>
             <wp:docPr id="1569445009" name="Image 1"/>
@@ -234,7 +264,16 @@
         </w:drawing>
       </w:r>
       <w:r>
-        <w:t>Generer une seance :</w:t>
+        <w:t>Générer</w:t>
+      </w:r>
+      <w:r>
+        <w:t xml:space="preserve"> une </w:t>
+      </w:r>
+      <w:r>
+        <w:t>séance</w:t>
+      </w:r>
+      <w:r>
+        <w:t> :</w:t>
       </w:r>
     </w:p>
     <w:p>
@@ -405,6 +444,229 @@
       <w:r>
         <w:t>Voici le catalogue d’exercice on peut y faire une recherche par nom, et les lister avec plusieurs filtres.</w:t>
       </w:r>
+    </w:p>
+    <w:p/>
+    <w:p/>
+    <w:p/>
+    <w:p/>
+    <w:p/>
+    <w:p/>
+    <w:p/>
+    <w:p/>
+    <w:p>
+      <w:pPr>
+        <w:pStyle w:val="Titre2"/>
+        <w:rPr>
+          <w:rFonts w:asciiTheme="minorHAnsi" w:hAnsiTheme="minorHAnsi" w:cstheme="minorBidi"/>
+          <w:kern w:val="0"/>
+          <w:lang w:eastAsia="fr-FR"/>
+          <w14:ligatures w14:val="none"/>
+        </w:rPr>
+      </w:pPr>
+      <w:r>
+        <w:rPr>
+          <w:rFonts w:asciiTheme="minorHAnsi" w:hAnsiTheme="minorHAnsi" w:cstheme="minorBidi"/>
+        </w:rPr>
+        <w:t>Documentation technique</w:t>
+      </w:r>
+    </w:p>
+    <w:p>
+      <w:pPr>
+        <w:rPr>
+          <w:kern w:val="0"/>
+          <w:lang w:eastAsia="fr-FR"/>
+          <w14:ligatures w14:val="none"/>
+        </w:rPr>
+      </w:pPr>
+      <w:r>
+        <w:t>Cette section décrit brièvement les fonctions utilisées pour la recherche, le tri et la normalisation des exercices dans le catalogue.</w:t>
+      </w:r>
+    </w:p>
+    <w:p>
+      <w:pPr>
+        <w:pStyle w:val="Titre3"/>
+        <w:rPr>
+          <w:rFonts w:cstheme="minorBidi"/>
+          <w:kern w:val="0"/>
+          <w:lang w:eastAsia="fr-FR"/>
+          <w14:ligatures w14:val="none"/>
+        </w:rPr>
+      </w:pPr>
+      <w:r>
+        <w:rPr>
+          <w:rFonts w:cstheme="minorBidi"/>
+        </w:rPr>
+        <w:t>Fonction _</w:t>
+      </w:r>
+      <w:proofErr w:type="spellStart"/>
+      <w:r>
+        <w:rPr>
+          <w:rFonts w:cstheme="minorBidi"/>
+        </w:rPr>
+        <w:t>applySearchAndSort</w:t>
+      </w:r>
+      <w:proofErr w:type="spellEnd"/>
+    </w:p>
+    <w:p>
+      <w:pPr>
+        <w:rPr>
+          <w:kern w:val="0"/>
+          <w:lang w:eastAsia="fr-FR"/>
+          <w14:ligatures w14:val="none"/>
+        </w:rPr>
+      </w:pPr>
+      <w:r>
+        <w:t>La fonction _</w:t>
+      </w:r>
+      <w:proofErr w:type="spellStart"/>
+      <w:r>
+        <w:t>applySearchAndSort</w:t>
+      </w:r>
+      <w:proofErr w:type="spellEnd"/>
+      <w:r>
+        <w:t xml:space="preserve"> prend en entrée une liste d'exercices, puis applique d'abord la recherche saisie par l'utilisateur. La requête est nettoyée avec _</w:t>
+      </w:r>
+      <w:proofErr w:type="spellStart"/>
+      <w:r>
+        <w:t>normalizeText</w:t>
+      </w:r>
+      <w:proofErr w:type="spellEnd"/>
+      <w:r>
+        <w:t xml:space="preserve"> afin de rendre la recherche insensible aux majuscules et aux accents. Si la recherche est vide, tous les exercices sont conservés. Sinon, la fonction construit un texte contenant le nom, la description, le groupe musculaire et le niveau de chaque exercice, puis vérifie si ce contenu contient la requête recherchée. Une fois la liste filtrée obtenue, elle est copiée puis triée grâce à _</w:t>
+      </w:r>
+      <w:proofErr w:type="spellStart"/>
+      <w:r>
+        <w:t>exerciseComparator</w:t>
+      </w:r>
+      <w:proofErr w:type="spellEnd"/>
+      <w:r>
+        <w:t>. La fonction retourne finalement la liste filtrée et triée.</w:t>
+      </w:r>
+    </w:p>
+    <w:p>
+      <w:pPr>
+        <w:pStyle w:val="Titre3"/>
+        <w:rPr>
+          <w:rFonts w:cstheme="minorBidi"/>
+          <w:kern w:val="0"/>
+          <w:lang w:eastAsia="fr-FR"/>
+          <w14:ligatures w14:val="none"/>
+        </w:rPr>
+      </w:pPr>
+      <w:r>
+        <w:rPr>
+          <w:rFonts w:cstheme="minorBidi"/>
+        </w:rPr>
+        <w:t>Fonction _</w:t>
+      </w:r>
+      <w:proofErr w:type="spellStart"/>
+      <w:r>
+        <w:rPr>
+          <w:rFonts w:cstheme="minorBidi"/>
+        </w:rPr>
+        <w:t>exerciseComparator</w:t>
+      </w:r>
+      <w:proofErr w:type="spellEnd"/>
+    </w:p>
+    <w:p>
+      <w:pPr>
+        <w:rPr>
+          <w:kern w:val="0"/>
+          <w:lang w:eastAsia="fr-FR"/>
+          <w14:ligatures w14:val="none"/>
+        </w:rPr>
+      </w:pPr>
+      <w:r>
+        <w:t>La fonction _</w:t>
+      </w:r>
+      <w:proofErr w:type="spellStart"/>
+      <w:r>
+        <w:t>exerciseComparator</w:t>
+      </w:r>
+      <w:proofErr w:type="spellEnd"/>
+      <w:r>
+        <w:t xml:space="preserve"> définit la manière dont deux exercices sont comparés pour le tri. Le comportement dépend de la valeur de _</w:t>
+      </w:r>
+      <w:proofErr w:type="spellStart"/>
+      <w:r>
+        <w:t>sortOption</w:t>
+      </w:r>
+      <w:proofErr w:type="spellEnd"/>
+      <w:r>
+        <w:t>. Le tri peut se faire par ordre alphabétique du nom, par durée croissante, par durée décroissante, par niveau ou par groupe musculaire. Pour les champs textuels, la comparaison passe par _</w:t>
+      </w:r>
+      <w:proofErr w:type="spellStart"/>
+      <w:r>
+        <w:t>normalizeText</w:t>
+      </w:r>
+      <w:proofErr w:type="spellEnd"/>
+      <w:r>
+        <w:t xml:space="preserve"> afin d'éviter les différences dues aux accents ou aux majuscules. Dans le cas du niveau, un ordre personnalisé est utilisé à l'aide de la table _</w:t>
+      </w:r>
+      <w:proofErr w:type="spellStart"/>
+      <w:r>
+        <w:t>levelOrder</w:t>
+      </w:r>
+      <w:proofErr w:type="spellEnd"/>
+      <w:r>
+        <w:t>, avec une valeur par défaut si le niveau n'est pas reconnu.</w:t>
+      </w:r>
+    </w:p>
+    <w:p>
+      <w:pPr>
+        <w:pStyle w:val="Titre3"/>
+        <w:rPr>
+          <w:rFonts w:cstheme="minorBidi"/>
+          <w:kern w:val="0"/>
+          <w:lang w:eastAsia="fr-FR"/>
+          <w14:ligatures w14:val="none"/>
+        </w:rPr>
+      </w:pPr>
+      <w:r>
+        <w:rPr>
+          <w:rFonts w:cstheme="minorBidi"/>
+        </w:rPr>
+        <w:t>Fonction _</w:t>
+      </w:r>
+      <w:proofErr w:type="spellStart"/>
+      <w:r>
+        <w:rPr>
+          <w:rFonts w:cstheme="minorBidi"/>
+        </w:rPr>
+        <w:t>normalizeText</w:t>
+      </w:r>
+      <w:proofErr w:type="spellEnd"/>
+    </w:p>
+    <w:p>
+      <w:pPr>
+        <w:rPr>
+          <w:kern w:val="0"/>
+          <w:lang w:eastAsia="fr-FR"/>
+          <w14:ligatures w14:val="none"/>
+        </w:rPr>
+      </w:pPr>
+      <w:r>
+        <w:t>La fonction _</w:t>
+      </w:r>
+      <w:proofErr w:type="spellStart"/>
+      <w:r>
+        <w:t>normalizeText</w:t>
+      </w:r>
+      <w:proofErr w:type="spellEnd"/>
+      <w:r>
+        <w:t xml:space="preserve"> sert à uniformiser les chaînes de caractères avant leur comparaison. Elle convertit tout le texte en minuscules puis remplace les lettres </w:t>
+      </w:r>
+      <w:r>
+        <w:lastRenderedPageBreak/>
+        <w:t>accentuées par leur version non accentuée, par exemple é devient e et ç devient c. Cela permet d'améliorer la fiabilité de la recherche et du tri, même si les mots sont écrits avec des variantes d'accents ou de casse.</w:t>
+      </w:r>
+    </w:p>
+    <w:p>
+      <w:pPr>
+        <w:tabs>
+          <w:tab w:val="left" w:pos="1101"/>
+        </w:tabs>
+      </w:pPr>
     </w:p>
     <w:sectPr>
       <w:pgSz w:w="11906" w:h="16838"/>

</xml_diff>